<commit_message>
add confidence interval section to report
</commit_message>
<xml_diff>
--- a/Thursday_lab/Lab6_Report.docx
+++ b/Thursday_lab/Lab6_Report.docx
@@ -66,32 +66,63 @@
           <w:i/>
           <w:iCs/>
         </w:rPr>
-        <w:t>met</w:t>
-      </w:r>
-      <w:r>
-        <w:t>), rosiglitazone (</w:t>
-      </w:r>
-      <w:proofErr w:type="spellStart"/>
+        <w:t>M</w:t>
+      </w:r>
       <w:r>
         <w:rPr>
           <w:i/>
           <w:iCs/>
         </w:rPr>
-        <w:t>rosi</w:t>
-      </w:r>
-      <w:proofErr w:type="spellEnd"/>
-      <w:r>
-        <w:t>), and lifestyle adjustments (</w:t>
+        <w:t>et</w:t>
+      </w:r>
+      <w:r>
+        <w:t>), rosiglitazone (</w:t>
       </w:r>
       <w:r>
         <w:rPr>
           <w:i/>
           <w:iCs/>
         </w:rPr>
-        <w:t>lifestyle</w:t>
+        <w:t>R</w:t>
+      </w:r>
+      <w:r>
+        <w:rPr>
+          <w:i/>
+          <w:iCs/>
+        </w:rPr>
+        <w:t>osi</w:t>
+      </w:r>
+      <w:r>
+        <w:t>), and lifestyle adjustments (</w:t>
+      </w:r>
+      <w:r>
+        <w:rPr>
+          <w:i/>
+          <w:iCs/>
+        </w:rPr>
+        <w:t>L</w:t>
+      </w:r>
+      <w:r>
+        <w:rPr>
+          <w:i/>
+          <w:iCs/>
+        </w:rPr>
+        <w:t>ifestyle</w:t>
       </w:r>
       <w:r>
         <w:t xml:space="preserve">). </w:t>
+      </w:r>
+      <w:r>
+        <w:t xml:space="preserve">To compare treatments, we must compare average treatment effects between </w:t>
+      </w:r>
+      <w:r>
+        <w:t>the three interventio</w:t>
+      </w:r>
+      <w:r>
+        <w:t>ns</w:t>
+      </w:r>
+      <w:r>
+        <w:t xml:space="preserve"> through bootstrapping to determine if there are any statistically significant differences.</w:t>
       </w:r>
     </w:p>
     <w:p>
@@ -263,15 +294,19 @@
     <w:p>
       <w:r>
         <w:tab/>
-        <w:t xml:space="preserve">When looking at each trial individually, both lifestyle and </w:t>
-      </w:r>
-      <w:proofErr w:type="spellStart"/>
-      <w:r>
-        <w:t>rosi</w:t>
-      </w:r>
-      <w:proofErr w:type="spellEnd"/>
-      <w:r>
-        <w:t xml:space="preserve"> </w:t>
+        <w:t xml:space="preserve">When looking at each trial individually, both </w:t>
+      </w:r>
+      <w:r>
+        <w:t>L</w:t>
+      </w:r>
+      <w:r>
+        <w:t xml:space="preserve">ifestyle and </w:t>
+      </w:r>
+      <w:r>
+        <w:t>R</w:t>
+      </w:r>
+      <w:r>
+        <w:t xml:space="preserve">osi </w:t>
       </w:r>
       <w:r>
         <w:t xml:space="preserve">interventions </w:t>
@@ -282,24 +317,32 @@
       <w:r>
         <w:t xml:space="preserve">an over 50% success rate in pre-diabetic treatment, with </w:t>
       </w:r>
-      <w:proofErr w:type="spellStart"/>
-      <w:r>
-        <w:t>rosi</w:t>
-      </w:r>
-      <w:proofErr w:type="spellEnd"/>
-      <w:r>
-        <w:t xml:space="preserve"> being highest at 61.4% success. Conversely, the met intervention only resulted in a 48.3% success rate. </w:t>
+      <w:r>
+        <w:t>R</w:t>
+      </w:r>
+      <w:r>
+        <w:t xml:space="preserve">osi being highest at 61.4% success. Conversely, the </w:t>
+      </w:r>
+      <w:r>
+        <w:t>M</w:t>
+      </w:r>
+      <w:r>
+        <w:t xml:space="preserve">et intervention only resulted in a 48.3% success rate. </w:t>
       </w:r>
       <w:r>
         <w:t xml:space="preserve">When comparing means, </w:t>
       </w:r>
-      <w:proofErr w:type="spellStart"/>
-      <w:r>
-        <w:t>rosi</w:t>
-      </w:r>
-      <w:proofErr w:type="spellEnd"/>
-      <w:r>
-        <w:t xml:space="preserve"> appears to be the best intervention, as it outperforms both met </w:t>
+      <w:r>
+        <w:t>R</w:t>
+      </w:r>
+      <w:r>
+        <w:t xml:space="preserve">osi appears to be the best intervention, as it outperforms both </w:t>
+      </w:r>
+      <w:r>
+        <w:t>M</w:t>
+      </w:r>
+      <w:r>
+        <w:t xml:space="preserve">et </w:t>
       </w:r>
       <w:r>
         <w:t xml:space="preserve">(Average Treatment Effect = </w:t>
@@ -308,7 +351,13 @@
         <w:t xml:space="preserve">0.131) </w:t>
       </w:r>
       <w:r>
-        <w:t>and lifestyle interventions</w:t>
+        <w:t xml:space="preserve">and </w:t>
+      </w:r>
+      <w:r>
+        <w:t>L</w:t>
+      </w:r>
+      <w:r>
+        <w:t>ifestyle interventions</w:t>
       </w:r>
       <w:r>
         <w:t xml:space="preserve"> (Average Treatment Effect = </w:t>
@@ -334,7 +383,137 @@
     </w:p>
     <w:p>
       <w:r>
+        <w:lastRenderedPageBreak/>
         <w:tab/>
+      </w:r>
+      <w:r>
+        <w:drawing>
+          <wp:inline distT="0" distB="0" distL="0" distR="0" wp14:anchorId="22CAE657" wp14:editId="68B3C012">
+            <wp:extent cx="1975812" cy="1916430"/>
+            <wp:effectExtent l="19050" t="19050" r="24765" b="26670"/>
+            <wp:docPr id="2138212338" name="Picture 1"/>
+            <wp:cNvGraphicFramePr>
+              <a:graphicFrameLocks xmlns:a="http://schemas.openxmlformats.org/drawingml/2006/main" noChangeAspect="1"/>
+            </wp:cNvGraphicFramePr>
+            <a:graphic xmlns:a="http://schemas.openxmlformats.org/drawingml/2006/main">
+              <a:graphicData uri="http://schemas.openxmlformats.org/drawingml/2006/picture">
+                <pic:pic xmlns:pic="http://schemas.openxmlformats.org/drawingml/2006/picture">
+                  <pic:nvPicPr>
+                    <pic:cNvPr id="2138212338" name=""/>
+                    <pic:cNvPicPr/>
+                  </pic:nvPicPr>
+                  <pic:blipFill>
+                    <a:blip r:embed="rId7"/>
+                    <a:stretch>
+                      <a:fillRect/>
+                    </a:stretch>
+                  </pic:blipFill>
+                  <pic:spPr>
+                    <a:xfrm>
+                      <a:off x="0" y="0"/>
+                      <a:ext cx="1987112" cy="1927390"/>
+                    </a:xfrm>
+                    <a:prstGeom prst="rect">
+                      <a:avLst/>
+                    </a:prstGeom>
+                    <a:ln>
+                      <a:solidFill>
+                        <a:schemeClr val="accent1"/>
+                      </a:solidFill>
+                    </a:ln>
+                  </pic:spPr>
+                </pic:pic>
+              </a:graphicData>
+            </a:graphic>
+          </wp:inline>
+        </w:drawing>
+      </w:r>
+    </w:p>
+    <w:p>
+      <w:pPr>
+        <w:rPr>
+          <w:i/>
+          <w:iCs/>
+        </w:rPr>
+      </w:pPr>
+      <w:r>
+        <w:rPr>
+          <w:i/>
+          <w:iCs/>
+        </w:rPr>
+        <w:t>Figure 2. Confidence Intervals for Pairwise Comparisons</w:t>
+      </w:r>
+    </w:p>
+    <w:p>
+      <w:pPr>
+        <w:ind w:firstLine="720"/>
+      </w:pPr>
+      <w:r>
+        <w:t xml:space="preserve">After bootstrapping </w:t>
+      </w:r>
+      <w:r>
+        <w:t xml:space="preserve">10,000 times, </w:t>
+      </w:r>
+      <w:r>
+        <w:t>confidence intervals for 90%, 95%, and 99% were calculated</w:t>
+      </w:r>
+      <w:r>
+        <w:t xml:space="preserve"> (with significance level </w:t>
+      </w:r>
+      <w:r>
+        <w:t>α</w:t>
+      </w:r>
+      <w:r>
+        <w:t xml:space="preserve"> at </w:t>
+      </w:r>
+      <w:r>
+        <w:t>0</w:t>
+      </w:r>
+      <w:r>
+        <w:t>.10, 0.05, and 0.01 respectively).</w:t>
+      </w:r>
+      <w:r>
+        <w:t xml:space="preserve"> </w:t>
+      </w:r>
+      <w:r>
+        <w:t xml:space="preserve"> </w:t>
+      </w:r>
+      <w:r>
+        <w:t xml:space="preserve">For these confidence intervals, we </w:t>
+      </w:r>
+      <w:r>
+        <w:t>can only reject the null hypothesis if the interval does not contain 0, because an interval with 0 means that</w:t>
+      </w:r>
+      <w:r>
+        <w:t xml:space="preserve">, if we resample many times, </w:t>
+      </w:r>
+      <w:r>
+        <w:rPr>
+          <w:i/>
+          <w:iCs/>
+        </w:rPr>
+        <w:t xml:space="preserve">no average treatment effect difference </w:t>
+      </w:r>
+      <w:r>
+        <w:t xml:space="preserve">is possible in 90, 95, or 99% of samples. </w:t>
+      </w:r>
+      <w:r>
+        <w:t>So within these confidence intervals specifically, Rosi outperforms Lifestyle at 90% CI</w:t>
+      </w:r>
+      <w:r>
+        <w:t xml:space="preserve"> but we fail to reject the null for 95% and 99%. For Rosi vs</w:t>
+      </w:r>
+      <w:r>
+        <w:t xml:space="preserve"> Met, Rosi outperforms Met at every confidence interval, so we successfully reject the null hypothesis that there is no difference between those groups (at all three significance levels). Finally, for Lifestyle – Met, </w:t>
+      </w:r>
+      <w:r>
+        <w:t>all three CIs include 0, which means that we fail to reject the null hypothesis</w:t>
+      </w:r>
+      <w:r>
+        <w:t xml:space="preserve">, because 0 is a possible treatment difference </w:t>
+      </w:r>
+      <w:r>
+        <w:t>at all three levels.</w:t>
       </w:r>
     </w:p>
     <w:p>

</xml_diff>